<commit_message>
refact: add multiple lokasi presensi
</commit_message>
<xml_diff>
--- a/docs/Manual_Book_V-People_HRIS.docx
+++ b/docs/Manual_Book_V-People_HRIS.docx
@@ -378,9 +378,6 @@
             </w:tcMar>
           </w:tcPr>
           <w:p>
-            <w:pPr>
-              <w:jc w:val="both"/>
-            </w:pPr>
             <w:r>
               <w:rPr>
                 <w:b/>
@@ -411,8 +408,37 @@
         <w:spacing w:after="80" w:line="259" w:lineRule="auto"/>
         <w:jc w:val="both"/>
       </w:pPr>
-      <w:r>
-        <w:t>Gunakan dokumen ini sebagai panduan pelatihan, referensi operasional harian, dan acuan kontrol akses modul V-People HRIS.</w:t>
+      <w:proofErr w:type="spellStart"/>
+      <w:r>
+        <w:t>Gunakan</w:t>
+      </w:r>
+      <w:proofErr w:type="spellEnd"/>
+      <w:r>
+        <w:t xml:space="preserve"> </w:t>
+      </w:r>
+      <w:proofErr w:type="spellStart"/>
+      <w:r>
+        <w:t>dokumen</w:t>
+      </w:r>
+      <w:proofErr w:type="spellEnd"/>
+      <w:r>
+        <w:t xml:space="preserve"> </w:t>
+      </w:r>
+      <w:proofErr w:type="spellStart"/>
+      <w:r>
+        <w:t>ini</w:t>
+      </w:r>
+      <w:proofErr w:type="spellEnd"/>
+      <w:r>
+        <w:t xml:space="preserve"> </w:t>
+      </w:r>
+      <w:proofErr w:type="spellStart"/>
+      <w:r>
+        <w:t>sebagai</w:t>
+      </w:r>
+      <w:proofErr w:type="spellEnd"/>
+      <w:r>
+        <w:t xml:space="preserve"> panduan pelatihan, referensi operasional harian, dan acuan kontrol akses modul V-People HRIS.</w:t>
       </w:r>
     </w:p>
     <w:p>
@@ -539,19 +565,6 @@
     </w:p>
     <w:p>
       <w:pPr>
-        <w:spacing w:after="100"/>
-        <w:jc w:val="both"/>
-      </w:pPr>
-      <w:r>
-        <w:rPr>
-          <w:color w:val="52616B"/>
-          <w:sz w:val="18"/>
-        </w:rPr>
-        <w:t>Catatan: nomor halaman otomatis dapat diperbarui dari Microsoft Word jika dokumen ini dikembangkan lagi dengan daftar isi penuh.</w:t>
-      </w:r>
-    </w:p>
-    <w:p>
-      <w:pPr>
         <w:pStyle w:val="Heading1"/>
         <w:spacing w:before="280" w:after="120"/>
         <w:jc w:val="both"/>
@@ -751,8 +764,54 @@
         <w:jc w:val="both"/>
       </w:pPr>
       <w:r>
-        <w:t>4. Setelah login, aplikasi mengarahkan ke Dashboard Admin atau Dashboard Karyawan sesuai akses akun.</w:t>
-      </w:r>
+        <w:t xml:space="preserve">4. Setelah login, aplikasi mengarahkan ke Dashboard Admin atau Dashboard </w:t>
+      </w:r>
+      <w:proofErr w:type="spellStart"/>
+      <w:r>
+        <w:t>Karyawan</w:t>
+      </w:r>
+      <w:proofErr w:type="spellEnd"/>
+      <w:r>
+        <w:t xml:space="preserve"> </w:t>
+      </w:r>
+      <w:proofErr w:type="spellStart"/>
+      <w:r>
+        <w:t>sesuai</w:t>
+      </w:r>
+      <w:proofErr w:type="spellEnd"/>
+      <w:r>
+        <w:t xml:space="preserve"> </w:t>
+      </w:r>
+      <w:proofErr w:type="spellStart"/>
+      <w:r>
+        <w:t>akses</w:t>
+      </w:r>
+      <w:proofErr w:type="spellEnd"/>
+      <w:r>
+        <w:t xml:space="preserve"> </w:t>
+      </w:r>
+      <w:proofErr w:type="spellStart"/>
+      <w:r>
+        <w:t>akun</w:t>
+      </w:r>
+      <w:proofErr w:type="spellEnd"/>
+      <w:r>
+        <w:t>.</w:t>
+      </w:r>
+    </w:p>
+    <w:p>
+      <w:pPr>
+        <w:spacing w:after="40" w:line="252" w:lineRule="auto"/>
+        <w:ind w:left="331" w:hanging="331"/>
+        <w:jc w:val="both"/>
+      </w:pPr>
+    </w:p>
+    <w:p>
+      <w:pPr>
+        <w:spacing w:after="40" w:line="252" w:lineRule="auto"/>
+        <w:ind w:left="331" w:hanging="331"/>
+        <w:jc w:val="both"/>
+      </w:pPr>
     </w:p>
     <w:p>
       <w:pPr>
@@ -1044,6 +1103,26 @@
             <w:vAlign w:val="center"/>
           </w:tcPr>
           <w:p>
+            <w:r>
+              <w:rPr>
+                <w:sz w:val="18"/>
+              </w:rPr>
+              <w:t>Semua data dan semua menu</w:t>
+            </w:r>
+          </w:p>
+        </w:tc>
+        <w:tc>
+          <w:tcPr>
+            <w:tcW w:w="5184" w:type="dxa"/>
+            <w:tcMar>
+              <w:top w:w="100" w:type="dxa"/>
+              <w:left w:w="120" w:type="dxa"/>
+              <w:bottom w:w="100" w:type="dxa"/>
+              <w:right w:w="120" w:type="dxa"/>
+            </w:tcMar>
+            <w:vAlign w:val="center"/>
+          </w:tcPr>
+          <w:p>
             <w:pPr>
               <w:jc w:val="both"/>
             </w:pPr>
@@ -1051,13 +1130,16 @@
               <w:rPr>
                 <w:sz w:val="18"/>
               </w:rPr>
-              <w:t>Semua data dan semua menu</w:t>
-            </w:r>
-          </w:p>
-        </w:tc>
-        <w:tc>
-          <w:tcPr>
-            <w:tcW w:w="5184" w:type="dxa"/>
+              <w:t>Digunakan untuk konfigurasi penuh, audit, role, dan akses darurat. Batasi pemakaiannya.</w:t>
+            </w:r>
+          </w:p>
+        </w:tc>
+      </w:tr>
+      <w:tr>
+        <w:tc>
+          <w:tcPr>
+            <w:tcW w:w="1944" w:type="dxa"/>
+            <w:shd w:val="clear" w:color="auto" w:fill="F7FAFC"/>
             <w:tcMar>
               <w:top w:w="100" w:type="dxa"/>
               <w:left w:w="120" w:type="dxa"/>
@@ -1074,15 +1156,34 @@
               <w:rPr>
                 <w:sz w:val="18"/>
               </w:rPr>
-              <w:t>Digunakan untuk konfigurasi penuh, audit, role, dan akses darurat. Batasi pemakaiannya.</w:t>
-            </w:r>
-          </w:p>
-        </w:tc>
-      </w:tr>
-      <w:tr>
-        <w:tc>
-          <w:tcPr>
-            <w:tcW w:w="1944" w:type="dxa"/>
+              <w:t>HR</w:t>
+            </w:r>
+          </w:p>
+        </w:tc>
+        <w:tc>
+          <w:tcPr>
+            <w:tcW w:w="2520" w:type="dxa"/>
+            <w:shd w:val="clear" w:color="auto" w:fill="F7FAFC"/>
+            <w:tcMar>
+              <w:top w:w="100" w:type="dxa"/>
+              <w:left w:w="120" w:type="dxa"/>
+              <w:bottom w:w="100" w:type="dxa"/>
+              <w:right w:w="120" w:type="dxa"/>
+            </w:tcMar>
+            <w:vAlign w:val="center"/>
+          </w:tcPr>
+          <w:p>
+            <w:r>
+              <w:rPr>
+                <w:sz w:val="18"/>
+              </w:rPr>
+              <w:t>Semua data karyawan</w:t>
+            </w:r>
+          </w:p>
+        </w:tc>
+        <w:tc>
+          <w:tcPr>
+            <w:tcW w:w="5184" w:type="dxa"/>
             <w:shd w:val="clear" w:color="auto" w:fill="F7FAFC"/>
             <w:tcMar>
               <w:top w:w="100" w:type="dxa"/>
@@ -1100,14 +1201,15 @@
               <w:rPr>
                 <w:sz w:val="18"/>
               </w:rPr>
-              <w:t>HR</w:t>
-            </w:r>
-          </w:p>
-        </w:tc>
-        <w:tc>
-          <w:tcPr>
-            <w:tcW w:w="2520" w:type="dxa"/>
-            <w:shd w:val="clear" w:color="auto" w:fill="F7FAFC"/>
+              <w:t>Mengelola data kepegawaian, approval HR, saldo cuti, kontrak, presensi, dan administrasi HR.</w:t>
+            </w:r>
+          </w:p>
+        </w:tc>
+      </w:tr>
+      <w:tr>
+        <w:tc>
+          <w:tcPr>
+            <w:tcW w:w="1944" w:type="dxa"/>
             <w:tcMar>
               <w:top w:w="100" w:type="dxa"/>
               <w:left w:w="120" w:type="dxa"/>
@@ -1124,14 +1226,33 @@
               <w:rPr>
                 <w:sz w:val="18"/>
               </w:rPr>
-              <w:t>Semua data karyawan</w:t>
+              <w:t>HOD</w:t>
+            </w:r>
+          </w:p>
+        </w:tc>
+        <w:tc>
+          <w:tcPr>
+            <w:tcW w:w="2520" w:type="dxa"/>
+            <w:tcMar>
+              <w:top w:w="100" w:type="dxa"/>
+              <w:left w:w="120" w:type="dxa"/>
+              <w:bottom w:w="100" w:type="dxa"/>
+              <w:right w:w="120" w:type="dxa"/>
+            </w:tcMar>
+            <w:vAlign w:val="center"/>
+          </w:tcPr>
+          <w:p>
+            <w:r>
+              <w:rPr>
+                <w:sz w:val="18"/>
+              </w:rPr>
+              <w:t>Departemen/divisi yang ditugaskan</w:t>
             </w:r>
           </w:p>
         </w:tc>
         <w:tc>
           <w:tcPr>
             <w:tcW w:w="5184" w:type="dxa"/>
-            <w:shd w:val="clear" w:color="auto" w:fill="F7FAFC"/>
             <w:tcMar>
               <w:top w:w="100" w:type="dxa"/>
               <w:left w:w="120" w:type="dxa"/>
@@ -1148,7 +1269,7 @@
               <w:rPr>
                 <w:sz w:val="18"/>
               </w:rPr>
-              <w:t>Mengelola data kepegawaian, approval HR, saldo cuti, kontrak, presensi, dan administrasi HR.</w:t>
+              <w:t>Memproses approval, delegasi approval, serta data operasional sesuai scope.</w:t>
             </w:r>
           </w:p>
         </w:tc>
@@ -1157,6 +1278,7 @@
         <w:tc>
           <w:tcPr>
             <w:tcW w:w="1944" w:type="dxa"/>
+            <w:shd w:val="clear" w:color="auto" w:fill="F7FAFC"/>
             <w:tcMar>
               <w:top w:w="100" w:type="dxa"/>
               <w:left w:w="120" w:type="dxa"/>
@@ -1173,13 +1295,35 @@
               <w:rPr>
                 <w:sz w:val="18"/>
               </w:rPr>
-              <w:t>HOD</w:t>
+              <w:t>Manager</w:t>
             </w:r>
           </w:p>
         </w:tc>
         <w:tc>
           <w:tcPr>
             <w:tcW w:w="2520" w:type="dxa"/>
+            <w:shd w:val="clear" w:color="auto" w:fill="F7FAFC"/>
+            <w:tcMar>
+              <w:top w:w="100" w:type="dxa"/>
+              <w:left w:w="120" w:type="dxa"/>
+              <w:bottom w:w="100" w:type="dxa"/>
+              <w:right w:w="120" w:type="dxa"/>
+            </w:tcMar>
+            <w:vAlign w:val="center"/>
+          </w:tcPr>
+          <w:p>
+            <w:r>
+              <w:rPr>
+                <w:sz w:val="18"/>
+              </w:rPr>
+              <w:t>Departemen yang sama</w:t>
+            </w:r>
+          </w:p>
+        </w:tc>
+        <w:tc>
+          <w:tcPr>
+            <w:tcW w:w="5184" w:type="dxa"/>
+            <w:shd w:val="clear" w:color="auto" w:fill="F7FAFC"/>
             <w:tcMar>
               <w:top w:w="100" w:type="dxa"/>
               <w:left w:w="120" w:type="dxa"/>
@@ -1196,13 +1340,15 @@
               <w:rPr>
                 <w:sz w:val="18"/>
               </w:rPr>
-              <w:t>Departemen/divisi yang ditugaskan</w:t>
-            </w:r>
-          </w:p>
-        </w:tc>
-        <w:tc>
-          <w:tcPr>
-            <w:tcW w:w="5184" w:type="dxa"/>
+              <w:t>Mengakses data karyawan sesuai departemen pemilik akun dan menu yang diberikan.</w:t>
+            </w:r>
+          </w:p>
+        </w:tc>
+      </w:tr>
+      <w:tr>
+        <w:tc>
+          <w:tcPr>
+            <w:tcW w:w="1944" w:type="dxa"/>
             <w:tcMar>
               <w:top w:w="100" w:type="dxa"/>
               <w:left w:w="120" w:type="dxa"/>
@@ -1219,16 +1365,33 @@
               <w:rPr>
                 <w:sz w:val="18"/>
               </w:rPr>
-              <w:t>Memproses approval, delegasi approval, serta data operasional sesuai scope.</w:t>
-            </w:r>
-          </w:p>
-        </w:tc>
-      </w:tr>
-      <w:tr>
-        <w:tc>
-          <w:tcPr>
-            <w:tcW w:w="1944" w:type="dxa"/>
-            <w:shd w:val="clear" w:color="auto" w:fill="F7FAFC"/>
+              <w:t>Supervisor</w:t>
+            </w:r>
+          </w:p>
+        </w:tc>
+        <w:tc>
+          <w:tcPr>
+            <w:tcW w:w="2520" w:type="dxa"/>
+            <w:tcMar>
+              <w:top w:w="100" w:type="dxa"/>
+              <w:left w:w="120" w:type="dxa"/>
+              <w:bottom w:w="100" w:type="dxa"/>
+              <w:right w:w="120" w:type="dxa"/>
+            </w:tcMar>
+            <w:vAlign w:val="center"/>
+          </w:tcPr>
+          <w:p>
+            <w:r>
+              <w:rPr>
+                <w:sz w:val="18"/>
+              </w:rPr>
+              <w:t>Divisi yang sama</w:t>
+            </w:r>
+          </w:p>
+        </w:tc>
+        <w:tc>
+          <w:tcPr>
+            <w:tcW w:w="5184" w:type="dxa"/>
             <w:tcMar>
               <w:top w:w="100" w:type="dxa"/>
               <w:left w:w="120" w:type="dxa"/>
@@ -1245,13 +1408,15 @@
               <w:rPr>
                 <w:sz w:val="18"/>
               </w:rPr>
-              <w:t>Manager</w:t>
-            </w:r>
-          </w:p>
-        </w:tc>
-        <w:tc>
-          <w:tcPr>
-            <w:tcW w:w="2520" w:type="dxa"/>
+              <w:t>Mengakses data karyawan sesuai divisi pemilik akun dan menu yang diberikan.</w:t>
+            </w:r>
+          </w:p>
+        </w:tc>
+      </w:tr>
+      <w:tr>
+        <w:tc>
+          <w:tcPr>
+            <w:tcW w:w="1944" w:type="dxa"/>
             <w:shd w:val="clear" w:color="auto" w:fill="F7FAFC"/>
             <w:tcMar>
               <w:top w:w="100" w:type="dxa"/>
@@ -1269,7 +1434,28 @@
               <w:rPr>
                 <w:sz w:val="18"/>
               </w:rPr>
-              <w:t>Departemen yang sama</w:t>
+              <w:t>Admin Divisi</w:t>
+            </w:r>
+          </w:p>
+        </w:tc>
+        <w:tc>
+          <w:tcPr>
+            <w:tcW w:w="2520" w:type="dxa"/>
+            <w:shd w:val="clear" w:color="auto" w:fill="F7FAFC"/>
+            <w:tcMar>
+              <w:top w:w="100" w:type="dxa"/>
+              <w:left w:w="120" w:type="dxa"/>
+              <w:bottom w:w="100" w:type="dxa"/>
+              <w:right w:w="120" w:type="dxa"/>
+            </w:tcMar>
+            <w:vAlign w:val="center"/>
+          </w:tcPr>
+          <w:p>
+            <w:r>
+              <w:rPr>
+                <w:sz w:val="18"/>
+              </w:rPr>
+              <w:t>Divisi yang ditugaskan</w:t>
             </w:r>
           </w:p>
         </w:tc>
@@ -1293,7 +1479,7 @@
               <w:rPr>
                 <w:sz w:val="18"/>
               </w:rPr>
-              <w:t>Mengakses data karyawan sesuai departemen pemilik akun dan menu yang diberikan.</w:t>
+              <w:t>Mengelola operasional hari off, shift, dan data karyawan pada divisi yang diberikan.</w:t>
             </w:r>
           </w:p>
         </w:tc>
@@ -1318,7 +1504,7 @@
               <w:rPr>
                 <w:sz w:val="18"/>
               </w:rPr>
-              <w:t>Supervisor</w:t>
+              <w:t>Staff / Staff Roster</w:t>
             </w:r>
           </w:p>
         </w:tc>
@@ -1334,154 +1520,6 @@
             <w:vAlign w:val="center"/>
           </w:tcPr>
           <w:p>
-            <w:pPr>
-              <w:jc w:val="both"/>
-            </w:pPr>
-            <w:r>
-              <w:rPr>
-                <w:sz w:val="18"/>
-              </w:rPr>
-              <w:t>Divisi yang sama</w:t>
-            </w:r>
-          </w:p>
-        </w:tc>
-        <w:tc>
-          <w:tcPr>
-            <w:tcW w:w="5184" w:type="dxa"/>
-            <w:tcMar>
-              <w:top w:w="100" w:type="dxa"/>
-              <w:left w:w="120" w:type="dxa"/>
-              <w:bottom w:w="100" w:type="dxa"/>
-              <w:right w:w="120" w:type="dxa"/>
-            </w:tcMar>
-            <w:vAlign w:val="center"/>
-          </w:tcPr>
-          <w:p>
-            <w:pPr>
-              <w:jc w:val="both"/>
-            </w:pPr>
-            <w:r>
-              <w:rPr>
-                <w:sz w:val="18"/>
-              </w:rPr>
-              <w:t>Mengakses data karyawan sesuai divisi pemilik akun dan menu yang diberikan.</w:t>
-            </w:r>
-          </w:p>
-        </w:tc>
-      </w:tr>
-      <w:tr>
-        <w:tc>
-          <w:tcPr>
-            <w:tcW w:w="1944" w:type="dxa"/>
-            <w:shd w:val="clear" w:color="auto" w:fill="F7FAFC"/>
-            <w:tcMar>
-              <w:top w:w="100" w:type="dxa"/>
-              <w:left w:w="120" w:type="dxa"/>
-              <w:bottom w:w="100" w:type="dxa"/>
-              <w:right w:w="120" w:type="dxa"/>
-            </w:tcMar>
-            <w:vAlign w:val="center"/>
-          </w:tcPr>
-          <w:p>
-            <w:pPr>
-              <w:jc w:val="both"/>
-            </w:pPr>
-            <w:r>
-              <w:rPr>
-                <w:sz w:val="18"/>
-              </w:rPr>
-              <w:t>Admin Divisi</w:t>
-            </w:r>
-          </w:p>
-        </w:tc>
-        <w:tc>
-          <w:tcPr>
-            <w:tcW w:w="2520" w:type="dxa"/>
-            <w:shd w:val="clear" w:color="auto" w:fill="F7FAFC"/>
-            <w:tcMar>
-              <w:top w:w="100" w:type="dxa"/>
-              <w:left w:w="120" w:type="dxa"/>
-              <w:bottom w:w="100" w:type="dxa"/>
-              <w:right w:w="120" w:type="dxa"/>
-            </w:tcMar>
-            <w:vAlign w:val="center"/>
-          </w:tcPr>
-          <w:p>
-            <w:pPr>
-              <w:jc w:val="both"/>
-            </w:pPr>
-            <w:r>
-              <w:rPr>
-                <w:sz w:val="18"/>
-              </w:rPr>
-              <w:t>Divisi yang ditugaskan</w:t>
-            </w:r>
-          </w:p>
-        </w:tc>
-        <w:tc>
-          <w:tcPr>
-            <w:tcW w:w="5184" w:type="dxa"/>
-            <w:shd w:val="clear" w:color="auto" w:fill="F7FAFC"/>
-            <w:tcMar>
-              <w:top w:w="100" w:type="dxa"/>
-              <w:left w:w="120" w:type="dxa"/>
-              <w:bottom w:w="100" w:type="dxa"/>
-              <w:right w:w="120" w:type="dxa"/>
-            </w:tcMar>
-            <w:vAlign w:val="center"/>
-          </w:tcPr>
-          <w:p>
-            <w:pPr>
-              <w:jc w:val="both"/>
-            </w:pPr>
-            <w:r>
-              <w:rPr>
-                <w:sz w:val="18"/>
-              </w:rPr>
-              <w:t>Mengelola operasional hari off, shift, dan data karyawan pada divisi yang diberikan.</w:t>
-            </w:r>
-          </w:p>
-        </w:tc>
-      </w:tr>
-      <w:tr>
-        <w:tc>
-          <w:tcPr>
-            <w:tcW w:w="1944" w:type="dxa"/>
-            <w:tcMar>
-              <w:top w:w="100" w:type="dxa"/>
-              <w:left w:w="120" w:type="dxa"/>
-              <w:bottom w:w="100" w:type="dxa"/>
-              <w:right w:w="120" w:type="dxa"/>
-            </w:tcMar>
-            <w:vAlign w:val="center"/>
-          </w:tcPr>
-          <w:p>
-            <w:pPr>
-              <w:jc w:val="both"/>
-            </w:pPr>
-            <w:r>
-              <w:rPr>
-                <w:sz w:val="18"/>
-              </w:rPr>
-              <w:t>Staff / Staff Roster</w:t>
-            </w:r>
-          </w:p>
-        </w:tc>
-        <w:tc>
-          <w:tcPr>
-            <w:tcW w:w="2520" w:type="dxa"/>
-            <w:tcMar>
-              <w:top w:w="100" w:type="dxa"/>
-              <w:left w:w="120" w:type="dxa"/>
-              <w:bottom w:w="100" w:type="dxa"/>
-              <w:right w:w="120" w:type="dxa"/>
-            </w:tcMar>
-            <w:vAlign w:val="center"/>
-          </w:tcPr>
-          <w:p>
-            <w:pPr>
-              <w:jc w:val="both"/>
-            </w:pPr>
             <w:r>
               <w:rPr>
                 <w:sz w:val="18"/>
@@ -1602,7 +1640,49 @@
               <w:rPr>
                 <w:sz w:val="18"/>
               </w:rPr>
-              <w:t xml:space="preserve"> data berdasarkan role. Contoh: Admin Divisi hanya melihat divisi yang ditugaskan, sedangkan HOD melihat departemen/divisi dalam scope-nya. Tombol yang disembunyikan bukan pengganti keamanan; akses URL tetap </w:t>
+              <w:t xml:space="preserve"> data </w:t>
+            </w:r>
+            <w:proofErr w:type="spellStart"/>
+            <w:r>
+              <w:rPr>
+                <w:sz w:val="18"/>
+              </w:rPr>
+              <w:t>berdasarkan</w:t>
+            </w:r>
+            <w:proofErr w:type="spellEnd"/>
+            <w:r>
+              <w:rPr>
+                <w:sz w:val="18"/>
+              </w:rPr>
+              <w:t xml:space="preserve"> role. Contoh: Admin Divisi hanya melihat divisi yang ditugaskan, sedangkan HOD melihat departemen/divisi dalam scope-nya. Tombol yang disembunyikan bukan pengganti keamanan; </w:t>
+            </w:r>
+            <w:proofErr w:type="spellStart"/>
+            <w:r>
+              <w:rPr>
+                <w:sz w:val="18"/>
+              </w:rPr>
+              <w:t>akses</w:t>
+            </w:r>
+            <w:proofErr w:type="spellEnd"/>
+            <w:r>
+              <w:rPr>
+                <w:sz w:val="18"/>
+              </w:rPr>
+              <w:t xml:space="preserve"> URL </w:t>
+            </w:r>
+            <w:proofErr w:type="spellStart"/>
+            <w:r>
+              <w:rPr>
+                <w:sz w:val="18"/>
+              </w:rPr>
+              <w:t>tetap</w:t>
+            </w:r>
+            <w:proofErr w:type="spellEnd"/>
+            <w:r>
+              <w:rPr>
+                <w:sz w:val="18"/>
+              </w:rPr>
+              <w:t xml:space="preserve"> </w:t>
             </w:r>
             <w:proofErr w:type="spellStart"/>
             <w:r>
@@ -1629,17 +1709,38 @@
     </w:p>
     <w:p>
       <w:pPr>
+        <w:jc w:val="both"/>
+      </w:pPr>
+    </w:p>
+    <w:p>
+      <w:pPr>
         <w:pStyle w:val="Heading2"/>
         <w:spacing w:before="160" w:after="60"/>
         <w:jc w:val="both"/>
       </w:pPr>
+      <w:proofErr w:type="spellStart"/>
       <w:r>
         <w:rPr>
           <w:rFonts w:ascii="Calibri" w:eastAsia="Calibri" w:hAnsi="Calibri"/>
         </w:rPr>
         <w:lastRenderedPageBreak/>
-        <w:t>Kelompok menu aktif</w:t>
-      </w:r>
+        <w:t>Kelompok</w:t>
+      </w:r>
+      <w:proofErr w:type="spellEnd"/>
+      <w:r>
+        <w:rPr>
+          <w:rFonts w:ascii="Calibri" w:eastAsia="Calibri" w:hAnsi="Calibri"/>
+        </w:rPr>
+        <w:t xml:space="preserve"> menu </w:t>
+      </w:r>
+      <w:proofErr w:type="spellStart"/>
+      <w:r>
+        <w:rPr>
+          <w:rFonts w:ascii="Calibri" w:eastAsia="Calibri" w:hAnsi="Calibri"/>
+        </w:rPr>
+        <w:t>aktif</w:t>
+      </w:r>
+      <w:proofErr w:type="spellEnd"/>
     </w:p>
     <w:tbl>
       <w:tblPr>
@@ -2804,6 +2905,9 @@
         </w:tc>
       </w:tr>
       <w:tr>
+        <w:trPr>
+          <w:trHeight w:val="397"/>
+        </w:trPr>
         <w:tc>
           <w:tcPr>
             <w:tcW w:w="2448" w:type="dxa"/>
@@ -2852,6 +2956,9 @@
         </w:tc>
       </w:tr>
       <w:tr>
+        <w:trPr>
+          <w:trHeight w:val="397"/>
+        </w:trPr>
         <w:tc>
           <w:tcPr>
             <w:tcW w:w="2448" w:type="dxa"/>
@@ -2902,6 +3009,9 @@
         </w:tc>
       </w:tr>
       <w:tr>
+        <w:trPr>
+          <w:trHeight w:val="397"/>
+        </w:trPr>
         <w:tc>
           <w:tcPr>
             <w:tcW w:w="2448" w:type="dxa"/>
@@ -2950,6 +3060,9 @@
         </w:tc>
       </w:tr>
       <w:tr>
+        <w:trPr>
+          <w:trHeight w:val="397"/>
+        </w:trPr>
         <w:tc>
           <w:tcPr>
             <w:tcW w:w="2448" w:type="dxa"/>
@@ -3104,7 +3217,31 @@
         <w:jc w:val="both"/>
       </w:pPr>
       <w:r>
-        <w:t xml:space="preserve">- Pantau approval HOD dan HR. Tanggal OFF yang sudah diproses tidak boleh diajukan ulang </w:t>
+        <w:t xml:space="preserve">- Pantau approval HOD dan HR. Tanggal OFF yang sudah diproses tidak </w:t>
+      </w:r>
+      <w:proofErr w:type="spellStart"/>
+      <w:r>
+        <w:t>boleh</w:t>
+      </w:r>
+      <w:proofErr w:type="spellEnd"/>
+      <w:r>
+        <w:t xml:space="preserve"> </w:t>
+      </w:r>
+      <w:proofErr w:type="spellStart"/>
+      <w:r>
+        <w:t>diajukan</w:t>
+      </w:r>
+      <w:proofErr w:type="spellEnd"/>
+      <w:r>
+        <w:t xml:space="preserve"> </w:t>
+      </w:r>
+      <w:proofErr w:type="spellStart"/>
+      <w:r>
+        <w:t>ulang</w:t>
+      </w:r>
+      <w:proofErr w:type="spellEnd"/>
+      <w:r>
+        <w:t xml:space="preserve"> </w:t>
       </w:r>
       <w:proofErr w:type="spellStart"/>
       <w:r>
@@ -3664,9 +3801,6 @@
             <w:vAlign w:val="center"/>
           </w:tcPr>
           <w:p>
-            <w:pPr>
-              <w:jc w:val="both"/>
-            </w:pPr>
             <w:r>
               <w:rPr>
                 <w:sz w:val="18"/>
@@ -3687,9 +3821,6 @@
             <w:vAlign w:val="center"/>
           </w:tcPr>
           <w:p>
-            <w:pPr>
-              <w:jc w:val="both"/>
-            </w:pPr>
             <w:r>
               <w:rPr>
                 <w:sz w:val="18"/>
@@ -3710,9 +3841,6 @@
             <w:vAlign w:val="center"/>
           </w:tcPr>
           <w:p>
-            <w:pPr>
-              <w:jc w:val="both"/>
-            </w:pPr>
             <w:r>
               <w:rPr>
                 <w:sz w:val="18"/>
@@ -3733,9 +3861,6 @@
             <w:vAlign w:val="center"/>
           </w:tcPr>
           <w:p>
-            <w:pPr>
-              <w:jc w:val="both"/>
-            </w:pPr>
             <w:r>
               <w:rPr>
                 <w:sz w:val="18"/>
@@ -3759,9 +3884,6 @@
             <w:vAlign w:val="center"/>
           </w:tcPr>
           <w:p>
-            <w:pPr>
-              <w:jc w:val="both"/>
-            </w:pPr>
             <w:r>
               <w:rPr>
                 <w:sz w:val="18"/>
@@ -3783,9 +3905,6 @@
             <w:vAlign w:val="center"/>
           </w:tcPr>
           <w:p>
-            <w:pPr>
-              <w:jc w:val="both"/>
-            </w:pPr>
             <w:r>
               <w:rPr>
                 <w:sz w:val="18"/>
@@ -3807,9 +3926,6 @@
             <w:vAlign w:val="center"/>
           </w:tcPr>
           <w:p>
-            <w:pPr>
-              <w:jc w:val="both"/>
-            </w:pPr>
             <w:r>
               <w:rPr>
                 <w:sz w:val="18"/>
@@ -3831,9 +3947,6 @@
             <w:vAlign w:val="center"/>
           </w:tcPr>
           <w:p>
-            <w:pPr>
-              <w:jc w:val="both"/>
-            </w:pPr>
             <w:r>
               <w:rPr>
                 <w:sz w:val="18"/>
@@ -3856,9 +3969,6 @@
             <w:vAlign w:val="center"/>
           </w:tcPr>
           <w:p>
-            <w:pPr>
-              <w:jc w:val="both"/>
-            </w:pPr>
             <w:r>
               <w:rPr>
                 <w:sz w:val="18"/>
@@ -3879,9 +3989,6 @@
             <w:vAlign w:val="center"/>
           </w:tcPr>
           <w:p>
-            <w:pPr>
-              <w:jc w:val="both"/>
-            </w:pPr>
             <w:r>
               <w:rPr>
                 <w:sz w:val="18"/>
@@ -3902,9 +4009,6 @@
             <w:vAlign w:val="center"/>
           </w:tcPr>
           <w:p>
-            <w:pPr>
-              <w:jc w:val="both"/>
-            </w:pPr>
             <w:r>
               <w:rPr>
                 <w:sz w:val="18"/>
@@ -3925,9 +4029,6 @@
             <w:vAlign w:val="center"/>
           </w:tcPr>
           <w:p>
-            <w:pPr>
-              <w:jc w:val="both"/>
-            </w:pPr>
             <w:r>
               <w:rPr>
                 <w:sz w:val="18"/>
@@ -3951,9 +4052,6 @@
             <w:vAlign w:val="center"/>
           </w:tcPr>
           <w:p>
-            <w:pPr>
-              <w:jc w:val="both"/>
-            </w:pPr>
             <w:r>
               <w:rPr>
                 <w:sz w:val="18"/>
@@ -3975,9 +4073,6 @@
             <w:vAlign w:val="center"/>
           </w:tcPr>
           <w:p>
-            <w:pPr>
-              <w:jc w:val="both"/>
-            </w:pPr>
             <w:r>
               <w:rPr>
                 <w:sz w:val="18"/>
@@ -3999,9 +4094,6 @@
             <w:vAlign w:val="center"/>
           </w:tcPr>
           <w:p>
-            <w:pPr>
-              <w:jc w:val="both"/>
-            </w:pPr>
             <w:r>
               <w:rPr>
                 <w:sz w:val="18"/>
@@ -4023,9 +4115,6 @@
             <w:vAlign w:val="center"/>
           </w:tcPr>
           <w:p>
-            <w:pPr>
-              <w:jc w:val="both"/>
-            </w:pPr>
             <w:r>
               <w:rPr>
                 <w:sz w:val="18"/>
@@ -4048,9 +4137,6 @@
             <w:vAlign w:val="center"/>
           </w:tcPr>
           <w:p>
-            <w:pPr>
-              <w:jc w:val="both"/>
-            </w:pPr>
             <w:r>
               <w:rPr>
                 <w:sz w:val="18"/>
@@ -4071,9 +4157,6 @@
             <w:vAlign w:val="center"/>
           </w:tcPr>
           <w:p>
-            <w:pPr>
-              <w:jc w:val="both"/>
-            </w:pPr>
             <w:r>
               <w:rPr>
                 <w:sz w:val="18"/>
@@ -4094,9 +4177,6 @@
             <w:vAlign w:val="center"/>
           </w:tcPr>
           <w:p>
-            <w:pPr>
-              <w:jc w:val="both"/>
-            </w:pPr>
             <w:r>
               <w:rPr>
                 <w:sz w:val="18"/>
@@ -4117,9 +4197,6 @@
             <w:vAlign w:val="center"/>
           </w:tcPr>
           <w:p>
-            <w:pPr>
-              <w:jc w:val="both"/>
-            </w:pPr>
             <w:r>
               <w:rPr>
                 <w:sz w:val="18"/>
@@ -4143,9 +4220,6 @@
             <w:vAlign w:val="center"/>
           </w:tcPr>
           <w:p>
-            <w:pPr>
-              <w:jc w:val="both"/>
-            </w:pPr>
             <w:r>
               <w:rPr>
                 <w:sz w:val="18"/>
@@ -4167,9 +4241,6 @@
             <w:vAlign w:val="center"/>
           </w:tcPr>
           <w:p>
-            <w:pPr>
-              <w:jc w:val="both"/>
-            </w:pPr>
             <w:r>
               <w:rPr>
                 <w:sz w:val="18"/>
@@ -4191,9 +4262,6 @@
             <w:vAlign w:val="center"/>
           </w:tcPr>
           <w:p>
-            <w:pPr>
-              <w:jc w:val="both"/>
-            </w:pPr>
             <w:r>
               <w:rPr>
                 <w:sz w:val="18"/>
@@ -4215,9 +4283,6 @@
             <w:vAlign w:val="center"/>
           </w:tcPr>
           <w:p>
-            <w:pPr>
-              <w:jc w:val="both"/>
-            </w:pPr>
             <w:r>
               <w:rPr>
                 <w:sz w:val="18"/>
@@ -5308,7 +5373,31 @@
         <w:jc w:val="both"/>
       </w:pPr>
       <w:r>
-        <w:t xml:space="preserve">7. Uji dengan akun karyawan pada divisi tersebut untuk memastikan </w:t>
+        <w:t xml:space="preserve">7. Uji dengan akun karyawan pada divisi </w:t>
+      </w:r>
+      <w:proofErr w:type="spellStart"/>
+      <w:r>
+        <w:t>tersebut</w:t>
+      </w:r>
+      <w:proofErr w:type="spellEnd"/>
+      <w:r>
+        <w:t xml:space="preserve"> </w:t>
+      </w:r>
+      <w:proofErr w:type="spellStart"/>
+      <w:r>
+        <w:t>untuk</w:t>
+      </w:r>
+      <w:proofErr w:type="spellEnd"/>
+      <w:r>
+        <w:t xml:space="preserve"> </w:t>
+      </w:r>
+      <w:proofErr w:type="spellStart"/>
+      <w:r>
+        <w:t>memastikan</w:t>
+      </w:r>
+      <w:proofErr w:type="spellEnd"/>
+      <w:r>
+        <w:t xml:space="preserve"> </w:t>
       </w:r>
       <w:proofErr w:type="spellStart"/>
       <w:r>
@@ -5692,9 +5781,6 @@
             </w:tcMar>
           </w:tcPr>
           <w:p>
-            <w:pPr>
-              <w:jc w:val="both"/>
-            </w:pPr>
             <w:r>
               <w:rPr>
                 <w:b/>
@@ -6151,7 +6237,31 @@
         <w:jc w:val="both"/>
       </w:pPr>
       <w:r>
-        <w:t xml:space="preserve">- Keputusan HR memperbarui status verification dan status presensi terkait jika bukti masih </w:t>
+        <w:t xml:space="preserve">- Keputusan HR memperbarui status verification dan status presensi terkait </w:t>
+      </w:r>
+      <w:proofErr w:type="spellStart"/>
+      <w:r>
+        <w:t>jika</w:t>
+      </w:r>
+      <w:proofErr w:type="spellEnd"/>
+      <w:r>
+        <w:t xml:space="preserve"> </w:t>
+      </w:r>
+      <w:proofErr w:type="spellStart"/>
+      <w:r>
+        <w:t>bukti</w:t>
+      </w:r>
+      <w:proofErr w:type="spellEnd"/>
+      <w:r>
+        <w:t xml:space="preserve"> </w:t>
+      </w:r>
+      <w:proofErr w:type="spellStart"/>
+      <w:r>
+        <w:t>masih</w:t>
+      </w:r>
+      <w:proofErr w:type="spellEnd"/>
+      <w:r>
+        <w:t xml:space="preserve"> </w:t>
       </w:r>
       <w:proofErr w:type="spellStart"/>
       <w:r>
@@ -6809,7 +6919,31 @@
         <w:jc w:val="both"/>
       </w:pPr>
       <w:r>
-        <w:t xml:space="preserve">- Untuk import queue, pesan sukses berarti file diterima dan sedang diproses, bukan berarti </w:t>
+        <w:t xml:space="preserve">- Untuk import queue, pesan sukses berarti file diterima dan sedang </w:t>
+      </w:r>
+      <w:proofErr w:type="spellStart"/>
+      <w:r>
+        <w:t>diproses</w:t>
+      </w:r>
+      <w:proofErr w:type="spellEnd"/>
+      <w:r>
+        <w:t xml:space="preserve">, </w:t>
+      </w:r>
+      <w:proofErr w:type="spellStart"/>
+      <w:r>
+        <w:t>bukan</w:t>
+      </w:r>
+      <w:proofErr w:type="spellEnd"/>
+      <w:r>
+        <w:t xml:space="preserve"> </w:t>
+      </w:r>
+      <w:proofErr w:type="spellStart"/>
+      <w:r>
+        <w:t>berarti</w:t>
+      </w:r>
+      <w:proofErr w:type="spellEnd"/>
+      <w:r>
+        <w:t xml:space="preserve"> </w:t>
       </w:r>
       <w:proofErr w:type="spellStart"/>
       <w:r>
@@ -7063,7 +7197,23 @@
         <w:jc w:val="both"/>
       </w:pPr>
       <w:r>
-        <w:t xml:space="preserve">- Kontrak elektronik, perpanjangan kontrak, saldo cuti, dan History Import sudah diuji dengan data contoh jika </w:t>
+        <w:t xml:space="preserve">- Kontrak elektronik, perpanjangan kontrak, saldo cuti, dan History Import sudah diuji dengan data </w:t>
+      </w:r>
+      <w:proofErr w:type="spellStart"/>
+      <w:r>
+        <w:t>contoh</w:t>
+      </w:r>
+      <w:proofErr w:type="spellEnd"/>
+      <w:r>
+        <w:t xml:space="preserve"> </w:t>
+      </w:r>
+      <w:proofErr w:type="spellStart"/>
+      <w:r>
+        <w:t>jika</w:t>
+      </w:r>
+      <w:proofErr w:type="spellEnd"/>
+      <w:r>
+        <w:t xml:space="preserve"> </w:t>
       </w:r>
       <w:proofErr w:type="spellStart"/>
       <w:r>
@@ -7238,9 +7388,6 @@
             <w:vAlign w:val="center"/>
           </w:tcPr>
           <w:p>
-            <w:pPr>
-              <w:jc w:val="both"/>
-            </w:pPr>
             <w:r>
               <w:rPr>
                 <w:sz w:val="18"/>
@@ -7261,9 +7408,6 @@
             <w:vAlign w:val="center"/>
           </w:tcPr>
           <w:p>
-            <w:pPr>
-              <w:jc w:val="both"/>
-            </w:pPr>
             <w:r>
               <w:rPr>
                 <w:sz w:val="18"/>
@@ -7284,9 +7428,6 @@
             <w:vAlign w:val="center"/>
           </w:tcPr>
           <w:p>
-            <w:pPr>
-              <w:jc w:val="both"/>
-            </w:pPr>
             <w:r>
               <w:rPr>
                 <w:sz w:val="18"/>
@@ -7310,9 +7451,6 @@
             <w:vAlign w:val="center"/>
           </w:tcPr>
           <w:p>
-            <w:pPr>
-              <w:jc w:val="both"/>
-            </w:pPr>
             <w:r>
               <w:rPr>
                 <w:sz w:val="18"/>
@@ -7334,9 +7472,6 @@
             <w:vAlign w:val="center"/>
           </w:tcPr>
           <w:p>
-            <w:pPr>
-              <w:jc w:val="both"/>
-            </w:pPr>
             <w:r>
               <w:rPr>
                 <w:sz w:val="18"/>
@@ -7358,9 +7493,6 @@
             <w:vAlign w:val="center"/>
           </w:tcPr>
           <w:p>
-            <w:pPr>
-              <w:jc w:val="both"/>
-            </w:pPr>
             <w:r>
               <w:rPr>
                 <w:sz w:val="18"/>
@@ -7383,9 +7515,6 @@
             <w:vAlign w:val="center"/>
           </w:tcPr>
           <w:p>
-            <w:pPr>
-              <w:jc w:val="both"/>
-            </w:pPr>
             <w:r>
               <w:rPr>
                 <w:sz w:val="18"/>
@@ -7406,9 +7535,6 @@
             <w:vAlign w:val="center"/>
           </w:tcPr>
           <w:p>
-            <w:pPr>
-              <w:jc w:val="both"/>
-            </w:pPr>
             <w:r>
               <w:rPr>
                 <w:sz w:val="18"/>
@@ -7429,9 +7555,6 @@
             <w:vAlign w:val="center"/>
           </w:tcPr>
           <w:p>
-            <w:pPr>
-              <w:jc w:val="both"/>
-            </w:pPr>
             <w:r>
               <w:rPr>
                 <w:sz w:val="18"/>
@@ -7455,9 +7578,6 @@
             <w:vAlign w:val="center"/>
           </w:tcPr>
           <w:p>
-            <w:pPr>
-              <w:jc w:val="both"/>
-            </w:pPr>
             <w:r>
               <w:rPr>
                 <w:sz w:val="18"/>
@@ -7479,9 +7599,6 @@
             <w:vAlign w:val="center"/>
           </w:tcPr>
           <w:p>
-            <w:pPr>
-              <w:jc w:val="both"/>
-            </w:pPr>
             <w:r>
               <w:rPr>
                 <w:sz w:val="18"/>
@@ -7503,9 +7620,6 @@
             <w:vAlign w:val="center"/>
           </w:tcPr>
           <w:p>
-            <w:pPr>
-              <w:jc w:val="both"/>
-            </w:pPr>
             <w:r>
               <w:rPr>
                 <w:sz w:val="18"/>
@@ -7528,9 +7642,6 @@
             <w:vAlign w:val="center"/>
           </w:tcPr>
           <w:p>
-            <w:pPr>
-              <w:jc w:val="both"/>
-            </w:pPr>
             <w:r>
               <w:rPr>
                 <w:sz w:val="18"/>
@@ -7551,9 +7662,6 @@
             <w:vAlign w:val="center"/>
           </w:tcPr>
           <w:p>
-            <w:pPr>
-              <w:jc w:val="both"/>
-            </w:pPr>
             <w:r>
               <w:rPr>
                 <w:sz w:val="18"/>
@@ -7574,9 +7682,6 @@
             <w:vAlign w:val="center"/>
           </w:tcPr>
           <w:p>
-            <w:pPr>
-              <w:jc w:val="both"/>
-            </w:pPr>
             <w:r>
               <w:rPr>
                 <w:sz w:val="18"/>
@@ -7600,9 +7705,6 @@
             <w:vAlign w:val="center"/>
           </w:tcPr>
           <w:p>
-            <w:pPr>
-              <w:jc w:val="both"/>
-            </w:pPr>
             <w:r>
               <w:rPr>
                 <w:sz w:val="18"/>
@@ -7624,9 +7726,6 @@
             <w:vAlign w:val="center"/>
           </w:tcPr>
           <w:p>
-            <w:pPr>
-              <w:jc w:val="both"/>
-            </w:pPr>
             <w:r>
               <w:rPr>
                 <w:sz w:val="18"/>
@@ -7648,9 +7747,6 @@
             <w:vAlign w:val="center"/>
           </w:tcPr>
           <w:p>
-            <w:pPr>
-              <w:jc w:val="both"/>
-            </w:pPr>
             <w:r>
               <w:rPr>
                 <w:sz w:val="18"/>
@@ -7673,9 +7769,6 @@
             <w:vAlign w:val="center"/>
           </w:tcPr>
           <w:p>
-            <w:pPr>
-              <w:jc w:val="both"/>
-            </w:pPr>
             <w:r>
               <w:rPr>
                 <w:sz w:val="18"/>
@@ -7703,9 +7796,6 @@
             <w:vAlign w:val="center"/>
           </w:tcPr>
           <w:p>
-            <w:pPr>
-              <w:jc w:val="both"/>
-            </w:pPr>
             <w:r>
               <w:rPr>
                 <w:sz w:val="18"/>
@@ -7734,9 +7824,6 @@
             <w:vAlign w:val="center"/>
           </w:tcPr>
           <w:p>
-            <w:pPr>
-              <w:jc w:val="both"/>
-            </w:pPr>
             <w:r>
               <w:rPr>
                 <w:sz w:val="18"/>
@@ -7768,9 +7855,6 @@
             <w:vAlign w:val="center"/>
           </w:tcPr>
           <w:p>
-            <w:pPr>
-              <w:jc w:val="both"/>
-            </w:pPr>
             <w:r>
               <w:rPr>
                 <w:sz w:val="18"/>
@@ -7793,9 +7877,6 @@
             <w:vAlign w:val="center"/>
           </w:tcPr>
           <w:p>
-            <w:pPr>
-              <w:jc w:val="both"/>
-            </w:pPr>
             <w:r>
               <w:rPr>
                 <w:sz w:val="18"/>
@@ -7817,9 +7898,6 @@
             <w:vAlign w:val="center"/>
           </w:tcPr>
           <w:p>
-            <w:pPr>
-              <w:jc w:val="both"/>
-            </w:pPr>
             <w:r>
               <w:rPr>
                 <w:sz w:val="18"/>
@@ -7842,9 +7920,6 @@
             <w:vAlign w:val="center"/>
           </w:tcPr>
           <w:p>
-            <w:pPr>
-              <w:jc w:val="both"/>
-            </w:pPr>
             <w:r>
               <w:rPr>
                 <w:sz w:val="18"/>
@@ -7865,9 +7940,6 @@
             <w:vAlign w:val="center"/>
           </w:tcPr>
           <w:p>
-            <w:pPr>
-              <w:jc w:val="both"/>
-            </w:pPr>
             <w:r>
               <w:rPr>
                 <w:sz w:val="18"/>
@@ -7888,9 +7960,6 @@
             <w:vAlign w:val="center"/>
           </w:tcPr>
           <w:p>
-            <w:pPr>
-              <w:jc w:val="both"/>
-            </w:pPr>
             <w:r>
               <w:rPr>
                 <w:sz w:val="18"/>
@@ -7914,9 +7983,6 @@
             <w:vAlign w:val="center"/>
           </w:tcPr>
           <w:p>
-            <w:pPr>
-              <w:jc w:val="both"/>
-            </w:pPr>
             <w:r>
               <w:rPr>
                 <w:sz w:val="18"/>
@@ -7938,9 +8004,6 @@
             <w:vAlign w:val="center"/>
           </w:tcPr>
           <w:p>
-            <w:pPr>
-              <w:jc w:val="both"/>
-            </w:pPr>
             <w:r>
               <w:rPr>
                 <w:sz w:val="18"/>
@@ -7962,9 +8025,6 @@
             <w:vAlign w:val="center"/>
           </w:tcPr>
           <w:p>
-            <w:pPr>
-              <w:jc w:val="both"/>
-            </w:pPr>
             <w:r>
               <w:rPr>
                 <w:sz w:val="18"/>
@@ -7987,9 +8047,6 @@
             <w:vAlign w:val="center"/>
           </w:tcPr>
           <w:p>
-            <w:pPr>
-              <w:jc w:val="both"/>
-            </w:pPr>
             <w:r>
               <w:rPr>
                 <w:sz w:val="18"/>
@@ -8010,9 +8067,6 @@
             <w:vAlign w:val="center"/>
           </w:tcPr>
           <w:p>
-            <w:pPr>
-              <w:jc w:val="both"/>
-            </w:pPr>
             <w:r>
               <w:rPr>
                 <w:sz w:val="18"/>
@@ -8033,9 +8087,6 @@
             <w:vAlign w:val="center"/>
           </w:tcPr>
           <w:p>
-            <w:pPr>
-              <w:jc w:val="both"/>
-            </w:pPr>
             <w:r>
               <w:rPr>
                 <w:sz w:val="18"/>

</xml_diff>